<commit_message>
Copleted labs 11,12 DB
</commit_message>
<xml_diff>
--- a/TERM-4_MP/Laboratory_06/Лабораторная работа 6.docx
+++ b/TERM-4_MP/Laboratory_06/Лабораторная работа 6.docx
@@ -260,8 +260,18 @@
           <w:sz w:val="28"/>
           <w:szCs w:val="28"/>
         </w:rPr>
-        <w:t>Преподаватель: Волчек Д.И.</w:t>
+        <w:t xml:space="preserve">Преподаватель: Волчек </w:t>
       </w:r>
+      <w:proofErr w:type="gramStart"/>
+      <w:r>
+        <w:rPr>
+          <w:rFonts w:ascii="Aptos Narrow" w:hAnsi="Aptos Narrow"/>
+          <w:sz w:val="28"/>
+          <w:szCs w:val="28"/>
+        </w:rPr>
+        <w:t>Д.И.</w:t>
+      </w:r>
+      <w:proofErr w:type="gramEnd"/>
     </w:p>
     <w:p>
       <w:pPr>
@@ -13974,7 +13984,7 @@
           <w:lang w:val="en-US"/>
         </w:rPr>
         <w:drawing>
-          <wp:inline distT="0" distB="0" distL="0" distR="0" wp14:anchorId="764FE278" wp14:editId="71B007A2">
+          <wp:inline distT="0" distB="0" distL="0" distR="0" wp14:anchorId="27345849" wp14:editId="1E2BA2E4">
             <wp:extent cx="5940425" cy="3495675"/>
             <wp:effectExtent l="0" t="0" r="3175" b="9525"/>
             <wp:docPr id="1433366572" name="Рисунок 1"/>
@@ -14960,10 +14970,10 @@
           <w:lang w:val="en-US"/>
         </w:rPr>
         <w:drawing>
-          <wp:inline distT="0" distB="0" distL="0" distR="0" wp14:anchorId="0C54EF0D" wp14:editId="31637C92">
-            <wp:extent cx="5940425" cy="3504565"/>
-            <wp:effectExtent l="0" t="0" r="3175" b="635"/>
-            <wp:docPr id="1681370587" name="Рисунок 1"/>
+          <wp:inline distT="0" distB="0" distL="0" distR="0" wp14:anchorId="7859885E" wp14:editId="13AC6A4E">
+            <wp:extent cx="5940425" cy="3618230"/>
+            <wp:effectExtent l="0" t="0" r="3175" b="1270"/>
+            <wp:docPr id="532853794" name="Рисунок 1"/>
             <wp:cNvGraphicFramePr>
               <a:graphicFrameLocks xmlns:a="http://schemas.openxmlformats.org/drawingml/2006/main" noChangeAspect="1"/>
             </wp:cNvGraphicFramePr>
@@ -14971,7 +14981,7 @@
               <a:graphicData uri="http://schemas.openxmlformats.org/drawingml/2006/picture">
                 <pic:pic xmlns:pic="http://schemas.openxmlformats.org/drawingml/2006/picture">
                   <pic:nvPicPr>
-                    <pic:cNvPr id="1681370587" name=""/>
+                    <pic:cNvPr id="532853794" name=""/>
                     <pic:cNvPicPr/>
                   </pic:nvPicPr>
                   <pic:blipFill>
@@ -14983,7 +14993,7 @@
                   <pic:spPr>
                     <a:xfrm>
                       <a:off x="0" y="0"/>
-                      <a:ext cx="5940425" cy="3504565"/>
+                      <a:ext cx="5940425" cy="3618230"/>
                     </a:xfrm>
                     <a:prstGeom prst="rect">
                       <a:avLst/>
@@ -15070,7 +15080,7 @@
                 <w:noProof/>
                 <w:lang w:val="en-US"/>
               </w:rPr>
-              <w:t>5</w:t>
+              <w:t>4</w:t>
             </w:r>
           </w:p>
         </w:tc>
@@ -15258,6 +15268,29 @@
                 <w:noProof/>
                 <w:lang w:val="en-US"/>
               </w:rPr>
+              <w:t>B</w:t>
+            </w:r>
+          </w:p>
+        </w:tc>
+        <w:tc>
+          <w:tcPr>
+            <w:tcW w:w="1231" w:type="dxa"/>
+          </w:tcPr>
+          <w:p>
+            <w:pPr>
+              <w:jc w:val="center"/>
+              <w:rPr>
+                <w:rFonts w:ascii="Aptos Narrow" w:hAnsi="Aptos Narrow"/>
+                <w:noProof/>
+                <w:lang w:val="en-US"/>
+              </w:rPr>
+            </w:pPr>
+            <w:r>
+              <w:rPr>
+                <w:rFonts w:ascii="Aptos Narrow" w:hAnsi="Aptos Narrow"/>
+                <w:noProof/>
+                <w:lang w:val="en-US"/>
+              </w:rPr>
               <w:t>G</w:t>
             </w:r>
           </w:p>
@@ -15281,29 +15314,6 @@
                 <w:noProof/>
                 <w:lang w:val="en-US"/>
               </w:rPr>
-              <w:t>G</w:t>
-            </w:r>
-          </w:p>
-        </w:tc>
-        <w:tc>
-          <w:tcPr>
-            <w:tcW w:w="1231" w:type="dxa"/>
-          </w:tcPr>
-          <w:p>
-            <w:pPr>
-              <w:jc w:val="center"/>
-              <w:rPr>
-                <w:rFonts w:ascii="Aptos Narrow" w:hAnsi="Aptos Narrow"/>
-                <w:noProof/>
-                <w:lang w:val="en-US"/>
-              </w:rPr>
-            </w:pPr>
-            <w:r>
-              <w:rPr>
-                <w:rFonts w:ascii="Aptos Narrow" w:hAnsi="Aptos Narrow"/>
-                <w:noProof/>
-                <w:lang w:val="en-US"/>
-              </w:rPr>
               <w:t>W</w:t>
             </w:r>
           </w:p>
@@ -15350,7 +15360,7 @@
                 <w:noProof/>
                 <w:lang w:val="en-US"/>
               </w:rPr>
-              <w:t>G</w:t>
+              <w:t>W</w:t>
             </w:r>
           </w:p>
         </w:tc>
@@ -15540,7 +15550,7 @@
                 <w:noProof/>
                 <w:lang w:val="en-US"/>
               </w:rPr>
-              <w:t>5</w:t>
+              <w:t>I</w:t>
             </w:r>
           </w:p>
         </w:tc>
@@ -15730,7 +15740,7 @@
                 <w:noProof/>
                 <w:lang w:val="en-US"/>
               </w:rPr>
-              <w:t>3</w:t>
+              <w:t>N</w:t>
             </w:r>
           </w:p>
         </w:tc>
@@ -15928,6 +15938,7 @@
     </w:tbl>
     <w:p>
       <w:pPr>
+        <w:jc w:val="center"/>
         <w:rPr>
           <w:rFonts w:ascii="Aptos Narrow" w:hAnsi="Aptos Narrow"/>
           <w:b/>
@@ -15945,10 +15956,10 @@
           <w:lang w:val="en-US"/>
         </w:rPr>
         <w:drawing>
-          <wp:inline distT="0" distB="0" distL="0" distR="0" wp14:anchorId="3D8AD50D" wp14:editId="121C23D3">
-            <wp:extent cx="5940425" cy="3495675"/>
-            <wp:effectExtent l="0" t="0" r="3175" b="9525"/>
-            <wp:docPr id="1255783511" name="Рисунок 1"/>
+          <wp:inline distT="0" distB="0" distL="0" distR="0" wp14:anchorId="69467B3E" wp14:editId="7F7AA531">
+            <wp:extent cx="5700155" cy="3351776"/>
+            <wp:effectExtent l="0" t="0" r="0" b="1270"/>
+            <wp:docPr id="943225076" name="Рисунок 1"/>
             <wp:cNvGraphicFramePr>
               <a:graphicFrameLocks xmlns:a="http://schemas.openxmlformats.org/drawingml/2006/main" noChangeAspect="1"/>
             </wp:cNvGraphicFramePr>
@@ -15956,7 +15967,7 @@
               <a:graphicData uri="http://schemas.openxmlformats.org/drawingml/2006/picture">
                 <pic:pic xmlns:pic="http://schemas.openxmlformats.org/drawingml/2006/picture">
                   <pic:nvPicPr>
-                    <pic:cNvPr id="1255783511" name=""/>
+                    <pic:cNvPr id="943225076" name=""/>
                     <pic:cNvPicPr/>
                   </pic:nvPicPr>
                   <pic:blipFill>
@@ -15968,7 +15979,7 @@
                   <pic:spPr>
                     <a:xfrm>
                       <a:off x="0" y="0"/>
-                      <a:ext cx="5940425" cy="3495675"/>
+                      <a:ext cx="5728483" cy="3368433"/>
                     </a:xfrm>
                     <a:prstGeom prst="rect">
                       <a:avLst/>
@@ -16056,7 +16067,7 @@
                 <w:noProof/>
                 <w:lang w:val="en-US"/>
               </w:rPr>
-              <w:t>6</w:t>
+              <w:t>5</w:t>
             </w:r>
           </w:p>
         </w:tc>
@@ -16244,6 +16255,29 @@
                 <w:noProof/>
                 <w:lang w:val="en-US"/>
               </w:rPr>
+              <w:t>B</w:t>
+            </w:r>
+          </w:p>
+        </w:tc>
+        <w:tc>
+          <w:tcPr>
+            <w:tcW w:w="1231" w:type="dxa"/>
+          </w:tcPr>
+          <w:p>
+            <w:pPr>
+              <w:jc w:val="center"/>
+              <w:rPr>
+                <w:rFonts w:ascii="Aptos Narrow" w:hAnsi="Aptos Narrow"/>
+                <w:noProof/>
+                <w:lang w:val="en-US"/>
+              </w:rPr>
+            </w:pPr>
+            <w:r>
+              <w:rPr>
+                <w:rFonts w:ascii="Aptos Narrow" w:hAnsi="Aptos Narrow"/>
+                <w:noProof/>
+                <w:lang w:val="en-US"/>
+              </w:rPr>
               <w:t>G</w:t>
             </w:r>
           </w:p>
@@ -16267,29 +16301,6 @@
                 <w:noProof/>
                 <w:lang w:val="en-US"/>
               </w:rPr>
-              <w:t>G</w:t>
-            </w:r>
-          </w:p>
-        </w:tc>
-        <w:tc>
-          <w:tcPr>
-            <w:tcW w:w="1231" w:type="dxa"/>
-          </w:tcPr>
-          <w:p>
-            <w:pPr>
-              <w:jc w:val="center"/>
-              <w:rPr>
-                <w:rFonts w:ascii="Aptos Narrow" w:hAnsi="Aptos Narrow"/>
-                <w:noProof/>
-                <w:lang w:val="en-US"/>
-              </w:rPr>
-            </w:pPr>
-            <w:r>
-              <w:rPr>
-                <w:rFonts w:ascii="Aptos Narrow" w:hAnsi="Aptos Narrow"/>
-                <w:noProof/>
-                <w:lang w:val="en-US"/>
-              </w:rPr>
               <w:t>W</w:t>
             </w:r>
           </w:p>
@@ -16313,7 +16324,7 @@
                 <w:noProof/>
                 <w:lang w:val="en-US"/>
               </w:rPr>
-              <w:t>G</w:t>
+              <w:t>W</w:t>
             </w:r>
           </w:p>
         </w:tc>
@@ -16503,7 +16514,7 @@
                 <w:noProof/>
                 <w:lang w:val="en-US"/>
               </w:rPr>
-              <w:t>6</w:t>
+              <w:t>I</w:t>
             </w:r>
           </w:p>
         </w:tc>
@@ -16693,7 +16704,7 @@
                 <w:noProof/>
                 <w:lang w:val="en-US"/>
               </w:rPr>
-              <w:t>6</w:t>
+              <w:t>N</w:t>
             </w:r>
           </w:p>
         </w:tc>
@@ -16931,10 +16942,10 @@
           <w:lang w:val="en-US"/>
         </w:rPr>
         <w:drawing>
-          <wp:inline distT="0" distB="0" distL="0" distR="0" wp14:anchorId="734E634F" wp14:editId="2144B1E1">
-            <wp:extent cx="5940425" cy="3481070"/>
-            <wp:effectExtent l="0" t="0" r="3175" b="5080"/>
-            <wp:docPr id="396788530" name="Рисунок 1"/>
+          <wp:inline distT="0" distB="0" distL="0" distR="0" wp14:anchorId="3DFFAFFD" wp14:editId="4851855A">
+            <wp:extent cx="5940425" cy="3466465"/>
+            <wp:effectExtent l="0" t="0" r="3175" b="635"/>
+            <wp:docPr id="3212069" name="Рисунок 1"/>
             <wp:cNvGraphicFramePr>
               <a:graphicFrameLocks xmlns:a="http://schemas.openxmlformats.org/drawingml/2006/main" noChangeAspect="1"/>
             </wp:cNvGraphicFramePr>
@@ -16942,7 +16953,7 @@
               <a:graphicData uri="http://schemas.openxmlformats.org/drawingml/2006/picture">
                 <pic:pic xmlns:pic="http://schemas.openxmlformats.org/drawingml/2006/picture">
                   <pic:nvPicPr>
-                    <pic:cNvPr id="396788530" name=""/>
+                    <pic:cNvPr id="3212069" name=""/>
                     <pic:cNvPicPr/>
                   </pic:nvPicPr>
                   <pic:blipFill>
@@ -16954,7 +16965,7 @@
                   <pic:spPr>
                     <a:xfrm>
                       <a:off x="0" y="0"/>
-                      <a:ext cx="5940425" cy="3481070"/>
+                      <a:ext cx="5940425" cy="3466465"/>
                     </a:xfrm>
                     <a:prstGeom prst="rect">
                       <a:avLst/>
@@ -17041,7 +17052,7 @@
                 <w:noProof/>
                 <w:lang w:val="en-US"/>
               </w:rPr>
-              <w:t>7</w:t>
+              <w:t>6</w:t>
             </w:r>
           </w:p>
         </w:tc>
@@ -17229,6 +17240,29 @@
                 <w:noProof/>
                 <w:lang w:val="en-US"/>
               </w:rPr>
+              <w:t>B</w:t>
+            </w:r>
+          </w:p>
+        </w:tc>
+        <w:tc>
+          <w:tcPr>
+            <w:tcW w:w="1231" w:type="dxa"/>
+          </w:tcPr>
+          <w:p>
+            <w:pPr>
+              <w:jc w:val="center"/>
+              <w:rPr>
+                <w:rFonts w:ascii="Aptos Narrow" w:hAnsi="Aptos Narrow"/>
+                <w:noProof/>
+                <w:lang w:val="en-US"/>
+              </w:rPr>
+            </w:pPr>
+            <w:r>
+              <w:rPr>
+                <w:rFonts w:ascii="Aptos Narrow" w:hAnsi="Aptos Narrow"/>
+                <w:noProof/>
+                <w:lang w:val="en-US"/>
+              </w:rPr>
               <w:t>G</w:t>
             </w:r>
           </w:p>
@@ -17252,30 +17286,7 @@
                 <w:noProof/>
                 <w:lang w:val="en-US"/>
               </w:rPr>
-              <w:t>G</w:t>
-            </w:r>
-          </w:p>
-        </w:tc>
-        <w:tc>
-          <w:tcPr>
-            <w:tcW w:w="1231" w:type="dxa"/>
-          </w:tcPr>
-          <w:p>
-            <w:pPr>
-              <w:jc w:val="center"/>
-              <w:rPr>
-                <w:rFonts w:ascii="Aptos Narrow" w:hAnsi="Aptos Narrow"/>
-                <w:noProof/>
-                <w:lang w:val="en-US"/>
-              </w:rPr>
-            </w:pPr>
-            <w:r>
-              <w:rPr>
-                <w:rFonts w:ascii="Aptos Narrow" w:hAnsi="Aptos Narrow"/>
-                <w:noProof/>
-                <w:lang w:val="en-US"/>
-              </w:rPr>
-              <w:t>G</w:t>
+              <w:t>W</w:t>
             </w:r>
           </w:p>
         </w:tc>
@@ -17465,7 +17476,7 @@
                 <w:noProof/>
                 <w:lang w:val="en-US"/>
               </w:rPr>
-              <w:t>7</w:t>
+              <w:t>I</w:t>
             </w:r>
           </w:p>
         </w:tc>
@@ -17655,7 +17666,7 @@
                 <w:noProof/>
                 <w:lang w:val="en-US"/>
               </w:rPr>
-              <w:t>6</w:t>
+              <w:t>N</w:t>
             </w:r>
           </w:p>
         </w:tc>
@@ -17916,10 +17927,10 @@
           <w:lang w:val="en-US"/>
         </w:rPr>
         <w:drawing>
-          <wp:inline distT="0" distB="0" distL="0" distR="0" wp14:anchorId="60F6D76C" wp14:editId="7C42BE23">
-            <wp:extent cx="5940425" cy="3495675"/>
-            <wp:effectExtent l="0" t="0" r="3175" b="9525"/>
-            <wp:docPr id="953067392" name="Рисунок 1"/>
+          <wp:inline distT="0" distB="0" distL="0" distR="0" wp14:anchorId="58E80E49" wp14:editId="5B30002C">
+            <wp:extent cx="5940425" cy="3406140"/>
+            <wp:effectExtent l="0" t="0" r="3175" b="3810"/>
+            <wp:docPr id="2036349329" name="Рисунок 1"/>
             <wp:cNvGraphicFramePr>
               <a:graphicFrameLocks xmlns:a="http://schemas.openxmlformats.org/drawingml/2006/main" noChangeAspect="1"/>
             </wp:cNvGraphicFramePr>
@@ -17927,7 +17938,7 @@
               <a:graphicData uri="http://schemas.openxmlformats.org/drawingml/2006/picture">
                 <pic:pic xmlns:pic="http://schemas.openxmlformats.org/drawingml/2006/picture">
                   <pic:nvPicPr>
-                    <pic:cNvPr id="953067392" name=""/>
+                    <pic:cNvPr id="2036349329" name=""/>
                     <pic:cNvPicPr/>
                   </pic:nvPicPr>
                   <pic:blipFill>
@@ -17939,7 +17950,7 @@
                   <pic:spPr>
                     <a:xfrm>
                       <a:off x="0" y="0"/>
-                      <a:ext cx="5940425" cy="3495675"/>
+                      <a:ext cx="5940425" cy="3406140"/>
                     </a:xfrm>
                     <a:prstGeom prst="rect">
                       <a:avLst/>
@@ -18003,6 +18014,7 @@
                 <w:noProof/>
                 <w:lang w:val="en-US"/>
               </w:rPr>
+              <w:lastRenderedPageBreak/>
               <w:t>t</w:t>
             </w:r>
           </w:p>
@@ -18026,7 +18038,7 @@
                 <w:noProof/>
                 <w:lang w:val="en-US"/>
               </w:rPr>
-              <w:t>8</w:t>
+              <w:t>7</w:t>
             </w:r>
           </w:p>
         </w:tc>
@@ -18214,6 +18226,29 @@
                 <w:noProof/>
                 <w:lang w:val="en-US"/>
               </w:rPr>
+              <w:t>B</w:t>
+            </w:r>
+          </w:p>
+        </w:tc>
+        <w:tc>
+          <w:tcPr>
+            <w:tcW w:w="1231" w:type="dxa"/>
+          </w:tcPr>
+          <w:p>
+            <w:pPr>
+              <w:jc w:val="center"/>
+              <w:rPr>
+                <w:rFonts w:ascii="Aptos Narrow" w:hAnsi="Aptos Narrow"/>
+                <w:noProof/>
+                <w:lang w:val="en-US"/>
+              </w:rPr>
+            </w:pPr>
+            <w:r>
+              <w:rPr>
+                <w:rFonts w:ascii="Aptos Narrow" w:hAnsi="Aptos Narrow"/>
+                <w:noProof/>
+                <w:lang w:val="en-US"/>
+              </w:rPr>
               <w:t>G</w:t>
             </w:r>
           </w:p>
@@ -18261,29 +18296,6 @@
                 <w:lang w:val="en-US"/>
               </w:rPr>
               <w:t>B</w:t>
-            </w:r>
-          </w:p>
-        </w:tc>
-        <w:tc>
-          <w:tcPr>
-            <w:tcW w:w="1231" w:type="dxa"/>
-          </w:tcPr>
-          <w:p>
-            <w:pPr>
-              <w:jc w:val="center"/>
-              <w:rPr>
-                <w:rFonts w:ascii="Aptos Narrow" w:hAnsi="Aptos Narrow"/>
-                <w:noProof/>
-                <w:lang w:val="en-US"/>
-              </w:rPr>
-            </w:pPr>
-            <w:r>
-              <w:rPr>
-                <w:rFonts w:ascii="Aptos Narrow" w:hAnsi="Aptos Narrow"/>
-                <w:noProof/>
-                <w:lang w:val="en-US"/>
-              </w:rPr>
-              <w:t>G</w:t>
             </w:r>
           </w:p>
         </w:tc>
@@ -18830,7 +18842,7 @@
                 <w:noProof/>
                 <w:lang w:val="en-US"/>
               </w:rPr>
-              <w:t>8</w:t>
+              <w:t>0</w:t>
             </w:r>
           </w:p>
         </w:tc>
@@ -18901,10 +18913,10 @@
           <w:lang w:val="en-US"/>
         </w:rPr>
         <w:drawing>
-          <wp:inline distT="0" distB="0" distL="0" distR="0" wp14:anchorId="0D36EE1C" wp14:editId="0F59695D">
-            <wp:extent cx="5940425" cy="3488055"/>
+          <wp:inline distT="0" distB="0" distL="0" distR="0" wp14:anchorId="2A4C959C" wp14:editId="3DFA2997">
+            <wp:extent cx="5940425" cy="3775075"/>
             <wp:effectExtent l="0" t="0" r="3175" b="0"/>
-            <wp:docPr id="1537892711" name="Рисунок 1"/>
+            <wp:docPr id="103973985" name="Рисунок 1"/>
             <wp:cNvGraphicFramePr>
               <a:graphicFrameLocks xmlns:a="http://schemas.openxmlformats.org/drawingml/2006/main" noChangeAspect="1"/>
             </wp:cNvGraphicFramePr>
@@ -18912,7 +18924,7 @@
               <a:graphicData uri="http://schemas.openxmlformats.org/drawingml/2006/picture">
                 <pic:pic xmlns:pic="http://schemas.openxmlformats.org/drawingml/2006/picture">
                   <pic:nvPicPr>
-                    <pic:cNvPr id="1537892711" name=""/>
+                    <pic:cNvPr id="103973985" name=""/>
                     <pic:cNvPicPr/>
                   </pic:nvPicPr>
                   <pic:blipFill>
@@ -18924,7 +18936,7 @@
                   <pic:spPr>
                     <a:xfrm>
                       <a:off x="0" y="0"/>
-                      <a:ext cx="5940425" cy="3488055"/>
+                      <a:ext cx="5940425" cy="3775075"/>
                     </a:xfrm>
                     <a:prstGeom prst="rect">
                       <a:avLst/>
@@ -19011,7 +19023,7 @@
                 <w:noProof/>
                 <w:lang w:val="en-US"/>
               </w:rPr>
-              <w:t>9</w:t>
+              <w:t>8</w:t>
             </w:r>
           </w:p>
         </w:tc>
@@ -19199,7 +19211,7 @@
                 <w:noProof/>
                 <w:lang w:val="en-US"/>
               </w:rPr>
-              <w:t>G</w:t>
+              <w:t>B</w:t>
             </w:r>
           </w:p>
         </w:tc>
@@ -19838,7 +19850,7 @@
                 <w:noProof/>
                 <w:lang w:val="en-US"/>
               </w:rPr>
-              <w:t>9</w:t>
+              <w:t>0</w:t>
             </w:r>
           </w:p>
         </w:tc>
@@ -19887,10 +19899,10 @@
         </w:rPr>
         <w:lastRenderedPageBreak/>
         <w:drawing>
-          <wp:inline distT="0" distB="0" distL="0" distR="0" wp14:anchorId="25630EBB" wp14:editId="6438EB0E">
-            <wp:extent cx="5940425" cy="3500755"/>
-            <wp:effectExtent l="0" t="0" r="3175" b="4445"/>
-            <wp:docPr id="1128121819" name="Рисунок 1"/>
+          <wp:inline distT="0" distB="0" distL="0" distR="0" wp14:anchorId="591E8437" wp14:editId="52A3E434">
+            <wp:extent cx="5940425" cy="3635375"/>
+            <wp:effectExtent l="0" t="0" r="3175" b="3175"/>
+            <wp:docPr id="1899716781" name="Рисунок 1"/>
             <wp:cNvGraphicFramePr>
               <a:graphicFrameLocks xmlns:a="http://schemas.openxmlformats.org/drawingml/2006/main" noChangeAspect="1"/>
             </wp:cNvGraphicFramePr>
@@ -19898,7 +19910,7 @@
               <a:graphicData uri="http://schemas.openxmlformats.org/drawingml/2006/picture">
                 <pic:pic xmlns:pic="http://schemas.openxmlformats.org/drawingml/2006/picture">
                   <pic:nvPicPr>
-                    <pic:cNvPr id="1128121819" name=""/>
+                    <pic:cNvPr id="1899716781" name=""/>
                     <pic:cNvPicPr/>
                   </pic:nvPicPr>
                   <pic:blipFill>
@@ -19910,7 +19922,7 @@
                   <pic:spPr>
                     <a:xfrm>
                       <a:off x="0" y="0"/>
-                      <a:ext cx="5940425" cy="3500755"/>
+                      <a:ext cx="5940425" cy="3635375"/>
                     </a:xfrm>
                     <a:prstGeom prst="rect">
                       <a:avLst/>
@@ -19997,7 +20009,7 @@
                 <w:noProof/>
                 <w:lang w:val="en-US"/>
               </w:rPr>
-              <w:t>10</w:t>
+              <w:t>9</w:t>
             </w:r>
           </w:p>
         </w:tc>
@@ -20185,6 +20197,29 @@
                 <w:noProof/>
                 <w:lang w:val="en-US"/>
               </w:rPr>
+              <w:t>B</w:t>
+            </w:r>
+          </w:p>
+        </w:tc>
+        <w:tc>
+          <w:tcPr>
+            <w:tcW w:w="1231" w:type="dxa"/>
+          </w:tcPr>
+          <w:p>
+            <w:pPr>
+              <w:jc w:val="center"/>
+              <w:rPr>
+                <w:rFonts w:ascii="Aptos Narrow" w:hAnsi="Aptos Narrow"/>
+                <w:noProof/>
+                <w:lang w:val="en-US"/>
+              </w:rPr>
+            </w:pPr>
+            <w:r>
+              <w:rPr>
+                <w:rFonts w:ascii="Aptos Narrow" w:hAnsi="Aptos Narrow"/>
+                <w:noProof/>
+                <w:lang w:val="en-US"/>
+              </w:rPr>
               <w:t>G</w:t>
             </w:r>
           </w:p>
@@ -20208,76 +20243,53 @@
                 <w:noProof/>
                 <w:lang w:val="en-US"/>
               </w:rPr>
+              <w:t>B</w:t>
+            </w:r>
+          </w:p>
+        </w:tc>
+        <w:tc>
+          <w:tcPr>
+            <w:tcW w:w="1231" w:type="dxa"/>
+          </w:tcPr>
+          <w:p>
+            <w:pPr>
+              <w:jc w:val="center"/>
+              <w:rPr>
+                <w:rFonts w:ascii="Aptos Narrow" w:hAnsi="Aptos Narrow"/>
+                <w:noProof/>
+                <w:lang w:val="en-US"/>
+              </w:rPr>
+            </w:pPr>
+            <w:r>
+              <w:rPr>
+                <w:rFonts w:ascii="Aptos Narrow" w:hAnsi="Aptos Narrow"/>
+                <w:noProof/>
+                <w:lang w:val="en-US"/>
+              </w:rPr>
+              <w:t>B</w:t>
+            </w:r>
+          </w:p>
+        </w:tc>
+        <w:tc>
+          <w:tcPr>
+            <w:tcW w:w="1231" w:type="dxa"/>
+          </w:tcPr>
+          <w:p>
+            <w:pPr>
+              <w:jc w:val="center"/>
+              <w:rPr>
+                <w:rFonts w:ascii="Aptos Narrow" w:hAnsi="Aptos Narrow"/>
+                <w:noProof/>
+                <w:lang w:val="en-US"/>
+              </w:rPr>
+            </w:pPr>
+            <w:r>
+              <w:rPr>
+                <w:rFonts w:ascii="Aptos Narrow" w:hAnsi="Aptos Narrow"/>
+                <w:noProof/>
+                <w:lang w:val="en-US"/>
+              </w:rPr>
               <w:t>G</w:t>
-            </w:r>
-          </w:p>
-        </w:tc>
-        <w:tc>
-          <w:tcPr>
-            <w:tcW w:w="1231" w:type="dxa"/>
-          </w:tcPr>
-          <w:p>
-            <w:pPr>
-              <w:jc w:val="center"/>
-              <w:rPr>
-                <w:rFonts w:ascii="Aptos Narrow" w:hAnsi="Aptos Narrow"/>
-                <w:noProof/>
-                <w:lang w:val="en-US"/>
-              </w:rPr>
-            </w:pPr>
-            <w:r>
-              <w:rPr>
-                <w:rFonts w:ascii="Aptos Narrow" w:hAnsi="Aptos Narrow"/>
-                <w:noProof/>
-                <w:lang w:val="en-US"/>
-              </w:rPr>
-              <w:t>B</w:t>
-            </w:r>
-          </w:p>
-        </w:tc>
-        <w:tc>
-          <w:tcPr>
-            <w:tcW w:w="1231" w:type="dxa"/>
-          </w:tcPr>
-          <w:p>
-            <w:pPr>
-              <w:jc w:val="center"/>
-              <w:rPr>
-                <w:rFonts w:ascii="Aptos Narrow" w:hAnsi="Aptos Narrow"/>
-                <w:noProof/>
-                <w:lang w:val="en-US"/>
-              </w:rPr>
-            </w:pPr>
-            <w:r>
-              <w:rPr>
-                <w:rFonts w:ascii="Aptos Narrow" w:hAnsi="Aptos Narrow"/>
-                <w:noProof/>
-                <w:lang w:val="en-US"/>
-              </w:rPr>
-              <w:t>B</w:t>
-            </w:r>
-          </w:p>
-        </w:tc>
-        <w:tc>
-          <w:tcPr>
-            <w:tcW w:w="1231" w:type="dxa"/>
-          </w:tcPr>
-          <w:p>
-            <w:pPr>
-              <w:jc w:val="center"/>
-              <w:rPr>
-                <w:rFonts w:ascii="Aptos Narrow" w:hAnsi="Aptos Narrow"/>
-                <w:noProof/>
-                <w:lang w:val="en-US"/>
-              </w:rPr>
-            </w:pPr>
-            <w:r>
-              <w:rPr>
-                <w:rFonts w:ascii="Aptos Narrow" w:hAnsi="Aptos Narrow"/>
-                <w:noProof/>
-                <w:lang w:val="en-US"/>
-              </w:rPr>
-              <w:t>B</w:t>
             </w:r>
           </w:p>
         </w:tc>
@@ -20847,7 +20859,7 @@
                 <w:noProof/>
                 <w:lang w:val="en-US"/>
               </w:rPr>
-              <w:t>10</w:t>
+              <w:t>0</w:t>
             </w:r>
           </w:p>
         </w:tc>
@@ -20872,10 +20884,10 @@
           <w:lang w:val="en-US"/>
         </w:rPr>
         <w:drawing>
-          <wp:inline distT="0" distB="0" distL="0" distR="0" wp14:anchorId="30C8B78D" wp14:editId="1F3669ED">
-            <wp:extent cx="5940425" cy="3474085"/>
+          <wp:inline distT="0" distB="0" distL="0" distR="0" wp14:anchorId="5044218B" wp14:editId="3BBE2065">
+            <wp:extent cx="5940425" cy="3565525"/>
             <wp:effectExtent l="0" t="0" r="3175" b="0"/>
-            <wp:docPr id="568039157" name="Рисунок 1"/>
+            <wp:docPr id="315501205" name="Рисунок 1"/>
             <wp:cNvGraphicFramePr>
               <a:graphicFrameLocks xmlns:a="http://schemas.openxmlformats.org/drawingml/2006/main" noChangeAspect="1"/>
             </wp:cNvGraphicFramePr>
@@ -20883,7 +20895,7 @@
               <a:graphicData uri="http://schemas.openxmlformats.org/drawingml/2006/picture">
                 <pic:pic xmlns:pic="http://schemas.openxmlformats.org/drawingml/2006/picture">
                   <pic:nvPicPr>
-                    <pic:cNvPr id="568039157" name=""/>
+                    <pic:cNvPr id="315501205" name=""/>
                     <pic:cNvPicPr/>
                   </pic:nvPicPr>
                   <pic:blipFill>
@@ -20895,7 +20907,7 @@
                   <pic:spPr>
                     <a:xfrm>
                       <a:off x="0" y="0"/>
-                      <a:ext cx="5940425" cy="3474085"/>
+                      <a:ext cx="5940425" cy="3565525"/>
                     </a:xfrm>
                     <a:prstGeom prst="rect">
                       <a:avLst/>
@@ -20982,7 +20994,7 @@
                 <w:noProof/>
                 <w:lang w:val="en-US"/>
               </w:rPr>
-              <w:t>11</w:t>
+              <w:t>10</w:t>
             </w:r>
           </w:p>
         </w:tc>
@@ -21481,6 +21493,7 @@
                 <w:noProof/>
                 <w:lang w:val="en-US"/>
               </w:rPr>
+              <w:lastRenderedPageBreak/>
               <w:t>P</w:t>
             </w:r>
           </w:p>
@@ -21671,7 +21684,6 @@
                 <w:noProof/>
                 <w:lang w:val="en-US"/>
               </w:rPr>
-              <w:lastRenderedPageBreak/>
               <w:t>F</w:t>
             </w:r>
           </w:p>
@@ -21741,7 +21753,7 @@
                 <w:noProof/>
                 <w:lang w:val="en-US"/>
               </w:rPr>
-              <w:t>11</w:t>
+              <w:t>0</w:t>
             </w:r>
           </w:p>
         </w:tc>
@@ -21858,10 +21870,10 @@
           <w:lang w:val="en-US"/>
         </w:rPr>
         <w:drawing>
-          <wp:inline distT="0" distB="0" distL="0" distR="0" wp14:anchorId="03EBFA97" wp14:editId="0EF92476">
-            <wp:extent cx="5940425" cy="3481705"/>
-            <wp:effectExtent l="0" t="0" r="3175" b="4445"/>
-            <wp:docPr id="118362398" name="Рисунок 1"/>
+          <wp:inline distT="0" distB="0" distL="0" distR="0" wp14:anchorId="56347A1A" wp14:editId="363D2717">
+            <wp:extent cx="5639587" cy="3324689"/>
+            <wp:effectExtent l="0" t="0" r="0" b="9525"/>
+            <wp:docPr id="63074639" name="Рисунок 1"/>
             <wp:cNvGraphicFramePr>
               <a:graphicFrameLocks xmlns:a="http://schemas.openxmlformats.org/drawingml/2006/main" noChangeAspect="1"/>
             </wp:cNvGraphicFramePr>
@@ -21869,7 +21881,7 @@
               <a:graphicData uri="http://schemas.openxmlformats.org/drawingml/2006/picture">
                 <pic:pic xmlns:pic="http://schemas.openxmlformats.org/drawingml/2006/picture">
                   <pic:nvPicPr>
-                    <pic:cNvPr id="118362398" name=""/>
+                    <pic:cNvPr id="63074639" name=""/>
                     <pic:cNvPicPr/>
                   </pic:nvPicPr>
                   <pic:blipFill>
@@ -21881,7 +21893,7 @@
                   <pic:spPr>
                     <a:xfrm>
                       <a:off x="0" y="0"/>
-                      <a:ext cx="5940425" cy="3481705"/>
+                      <a:ext cx="5639587" cy="3324689"/>
                     </a:xfrm>
                     <a:prstGeom prst="rect">
                       <a:avLst/>
@@ -21968,7 +21980,7 @@
                 <w:noProof/>
                 <w:lang w:val="en-US"/>
               </w:rPr>
-              <w:t>12</w:t>
+              <w:t>11</w:t>
             </w:r>
           </w:p>
         </w:tc>
@@ -22749,7 +22761,7 @@
                 <w:noProof/>
                 <w:lang w:val="en-US"/>
               </w:rPr>
-              <w:t>12</w:t>
+              <w:t>0</w:t>
             </w:r>
           </w:p>
         </w:tc>
@@ -24951,12 +24963,40 @@
             <w:pPr>
               <w:rPr>
                 <w:rFonts w:ascii="Aptos Narrow" w:hAnsi="Aptos Narrow"/>
-                <w:b/>
-                <w:bCs/>
-                <w:sz w:val="28"/>
-                <w:szCs w:val="28"/>
-              </w:rPr>
-            </w:pPr>
+                <w:lang w:val="en-US"/>
+              </w:rPr>
+            </w:pPr>
+            <w:r>
+              <w:rPr>
+                <w:rFonts w:ascii="Aptos Narrow" w:hAnsi="Aptos Narrow"/>
+              </w:rPr>
+              <w:t xml:space="preserve">Структуры </w:t>
+            </w:r>
+            <w:proofErr w:type="spellStart"/>
+            <w:r>
+              <w:rPr>
+                <w:rFonts w:ascii="Aptos Narrow" w:hAnsi="Aptos Narrow"/>
+                <w:lang w:val="en-US"/>
+              </w:rPr>
+              <w:t>AMatrix</w:t>
+            </w:r>
+            <w:proofErr w:type="spellEnd"/>
+            <w:r>
+              <w:rPr>
+                <w:rFonts w:ascii="Aptos Narrow" w:hAnsi="Aptos Narrow"/>
+                <w:lang w:val="en-US"/>
+              </w:rPr>
+              <w:t xml:space="preserve">, </w:t>
+            </w:r>
+            <w:proofErr w:type="spellStart"/>
+            <w:r>
+              <w:rPr>
+                <w:rFonts w:ascii="Aptos Narrow" w:hAnsi="Aptos Narrow"/>
+                <w:lang w:val="en-US"/>
+              </w:rPr>
+              <w:t>AList</w:t>
+            </w:r>
+            <w:proofErr w:type="spellEnd"/>
           </w:p>
         </w:tc>
         <w:tc>
@@ -25030,12 +25070,14 @@
             <w:pPr>
               <w:rPr>
                 <w:rFonts w:ascii="Aptos Narrow" w:hAnsi="Aptos Narrow"/>
-                <w:b/>
-                <w:bCs/>
-                <w:sz w:val="28"/>
-                <w:szCs w:val="28"/>
-              </w:rPr>
-            </w:pPr>
+              </w:rPr>
+            </w:pPr>
+            <w:r>
+              <w:rPr>
+                <w:rFonts w:ascii="Aptos Narrow" w:hAnsi="Aptos Narrow"/>
+              </w:rPr>
+              <w:t>Функции конвертации</w:t>
+            </w:r>
           </w:p>
         </w:tc>
         <w:tc>
@@ -25109,24 +25151,14 @@
             <w:pPr>
               <w:rPr>
                 <w:rFonts w:ascii="Aptos Narrow" w:hAnsi="Aptos Narrow"/>
-                <w:b/>
-                <w:bCs/>
-                <w:sz w:val="28"/>
-                <w:szCs w:val="28"/>
-                <w:lang w:val="en-US"/>
-              </w:rPr>
-            </w:pPr>
-            <w:r>
-              <w:rPr>
-                <w:rFonts w:ascii="Aptos Narrow" w:hAnsi="Aptos Narrow"/>
-                <w:b/>
-                <w:bCs/>
-                <w:sz w:val="28"/>
-                <w:szCs w:val="28"/>
-                <w:lang w:val="en-US"/>
+              </w:rPr>
+            </w:pPr>
+            <w:r>
+              <w:rPr>
+                <w:rFonts w:ascii="Aptos Narrow" w:hAnsi="Aptos Narrow"/>
               </w:rPr>
               <w:lastRenderedPageBreak/>
-              <w:t xml:space="preserve"> </w:t>
+              <w:t>Код алгоритма обхода графа в ширину</w:t>
             </w:r>
           </w:p>
         </w:tc>
@@ -25201,12 +25233,14 @@
             <w:pPr>
               <w:rPr>
                 <w:rFonts w:ascii="Aptos Narrow" w:hAnsi="Aptos Narrow"/>
-                <w:b/>
-                <w:bCs/>
-                <w:sz w:val="28"/>
-                <w:szCs w:val="28"/>
-              </w:rPr>
-            </w:pPr>
+              </w:rPr>
+            </w:pPr>
+            <w:r>
+              <w:rPr>
+                <w:rFonts w:ascii="Aptos Narrow" w:hAnsi="Aptos Narrow"/>
+              </w:rPr>
+              <w:t>Результат работы кода</w:t>
+            </w:r>
           </w:p>
         </w:tc>
         <w:tc>
@@ -25350,10 +25384,20 @@
                 <w:rFonts w:ascii="Aptos Narrow" w:hAnsi="Aptos Narrow"/>
                 <w:b/>
                 <w:bCs/>
-                <w:sz w:val="28"/>
-                <w:szCs w:val="28"/>
-              </w:rPr>
-            </w:pPr>
+              </w:rPr>
+            </w:pPr>
+            <w:r>
+              <w:rPr>
+                <w:rFonts w:ascii="Aptos Narrow" w:hAnsi="Aptos Narrow"/>
+              </w:rPr>
+              <w:t xml:space="preserve">Код алгоритма обхода графа в </w:t>
+            </w:r>
+            <w:r>
+              <w:rPr>
+                <w:rFonts w:ascii="Aptos Narrow" w:hAnsi="Aptos Narrow"/>
+              </w:rPr>
+              <w:t>глубину</w:t>
+            </w:r>
           </w:p>
         </w:tc>
         <w:tc>
@@ -25375,6 +25419,7 @@
                 <w:rFonts w:ascii="Aptos Narrow" w:hAnsi="Aptos Narrow"/>
                 <w:b/>
                 <w:bCs/>
+                <w:noProof/>
                 <w:sz w:val="28"/>
                 <w:szCs w:val="28"/>
               </w:rPr>
@@ -25426,33 +25471,36 @@
             <w:pPr>
               <w:rPr>
                 <w:rFonts w:ascii="Aptos Narrow" w:hAnsi="Aptos Narrow"/>
+              </w:rPr>
+            </w:pPr>
+            <w:r>
+              <w:rPr>
+                <w:rFonts w:ascii="Aptos Narrow" w:hAnsi="Aptos Narrow"/>
+              </w:rPr>
+              <w:t>Результат работы кода</w:t>
+            </w:r>
+          </w:p>
+        </w:tc>
+        <w:tc>
+          <w:tcPr>
+            <w:tcW w:w="5346" w:type="dxa"/>
+          </w:tcPr>
+          <w:p>
+            <w:pPr>
+              <w:rPr>
+                <w:rFonts w:ascii="Aptos Narrow" w:hAnsi="Aptos Narrow"/>
                 <w:b/>
                 <w:bCs/>
                 <w:sz w:val="28"/>
                 <w:szCs w:val="28"/>
               </w:rPr>
             </w:pPr>
-          </w:p>
-        </w:tc>
-        <w:tc>
-          <w:tcPr>
-            <w:tcW w:w="5346" w:type="dxa"/>
-          </w:tcPr>
-          <w:p>
-            <w:pPr>
+            <w:r>
               <w:rPr>
                 <w:rFonts w:ascii="Aptos Narrow" w:hAnsi="Aptos Narrow"/>
                 <w:b/>
                 <w:bCs/>
-                <w:sz w:val="28"/>
-                <w:szCs w:val="28"/>
-              </w:rPr>
-            </w:pPr>
-            <w:r>
-              <w:rPr>
-                <w:rFonts w:ascii="Aptos Narrow" w:hAnsi="Aptos Narrow"/>
-                <w:b/>
-                <w:bCs/>
+                <w:noProof/>
                 <w:sz w:val="28"/>
                 <w:szCs w:val="28"/>
               </w:rPr>
@@ -25601,6 +25649,18 @@
                 <w:szCs w:val="28"/>
               </w:rPr>
             </w:pPr>
+            <w:r>
+              <w:rPr>
+                <w:rFonts w:ascii="Aptos Narrow" w:hAnsi="Aptos Narrow"/>
+              </w:rPr>
+              <w:t xml:space="preserve">Код алгоритма </w:t>
+            </w:r>
+            <w:r>
+              <w:rPr>
+                <w:rFonts w:ascii="Aptos Narrow" w:hAnsi="Aptos Narrow"/>
+              </w:rPr>
+              <w:t>топологической сортировки</w:t>
+            </w:r>
           </w:p>
         </w:tc>
         <w:tc>
@@ -25622,6 +25682,7 @@
                 <w:rFonts w:ascii="Aptos Narrow" w:hAnsi="Aptos Narrow"/>
                 <w:b/>
                 <w:bCs/>
+                <w:noProof/>
                 <w:sz w:val="28"/>
                 <w:szCs w:val="28"/>
               </w:rPr>
@@ -25673,33 +25734,36 @@
             <w:pPr>
               <w:rPr>
                 <w:rFonts w:ascii="Aptos Narrow" w:hAnsi="Aptos Narrow"/>
+              </w:rPr>
+            </w:pPr>
+            <w:r>
+              <w:rPr>
+                <w:rFonts w:ascii="Aptos Narrow" w:hAnsi="Aptos Narrow"/>
+              </w:rPr>
+              <w:t>Результат работы кода</w:t>
+            </w:r>
+          </w:p>
+        </w:tc>
+        <w:tc>
+          <w:tcPr>
+            <w:tcW w:w="5346" w:type="dxa"/>
+          </w:tcPr>
+          <w:p>
+            <w:pPr>
+              <w:rPr>
+                <w:rFonts w:ascii="Aptos Narrow" w:hAnsi="Aptos Narrow"/>
                 <w:b/>
                 <w:bCs/>
                 <w:sz w:val="28"/>
                 <w:szCs w:val="28"/>
               </w:rPr>
             </w:pPr>
-          </w:p>
-        </w:tc>
-        <w:tc>
-          <w:tcPr>
-            <w:tcW w:w="5346" w:type="dxa"/>
-          </w:tcPr>
-          <w:p>
-            <w:pPr>
+            <w:r>
               <w:rPr>
                 <w:rFonts w:ascii="Aptos Narrow" w:hAnsi="Aptos Narrow"/>
                 <w:b/>
                 <w:bCs/>
-                <w:sz w:val="28"/>
-                <w:szCs w:val="28"/>
-              </w:rPr>
-            </w:pPr>
-            <w:r>
-              <w:rPr>
-                <w:rFonts w:ascii="Aptos Narrow" w:hAnsi="Aptos Narrow"/>
-                <w:b/>
-                <w:bCs/>
+                <w:noProof/>
                 <w:sz w:val="28"/>
                 <w:szCs w:val="28"/>
               </w:rPr>
@@ -25828,7 +25892,21 @@
         <w:rPr>
           <w:rFonts w:ascii="Aptos Narrow" w:hAnsi="Aptos Narrow"/>
         </w:rPr>
-        <w:t>Выбрать произвольную вершину графа, с которой начнется построение. Пометить её как «текущую». Остальные вершины считаются непосещенными.</w:t>
+        <w:t xml:space="preserve">Выбрать произвольную вершину графа, с которой начнется построение. Пометить её как «текущую». Остальные вершины считаются </w:t>
+      </w:r>
+      <w:proofErr w:type="spellStart"/>
+      <w:r>
+        <w:rPr>
+          <w:rFonts w:ascii="Aptos Narrow" w:hAnsi="Aptos Narrow"/>
+        </w:rPr>
+        <w:t>непосещенными</w:t>
+      </w:r>
+      <w:proofErr w:type="spellEnd"/>
+      <w:r>
+        <w:rPr>
+          <w:rFonts w:ascii="Aptos Narrow" w:hAnsi="Aptos Narrow"/>
+        </w:rPr>
+        <w:t>.</w:t>
       </w:r>
     </w:p>
     <w:p>
@@ -25845,7 +25923,21 @@
         <w:rPr>
           <w:rFonts w:ascii="Aptos Narrow" w:hAnsi="Aptos Narrow"/>
         </w:rPr>
-        <w:t>Для текущей вершины поместить все остальные смежные непосещенные вершины в приоритетную очередь.</w:t>
+        <w:t xml:space="preserve">Для текущей вершины поместить все остальные смежные </w:t>
+      </w:r>
+      <w:proofErr w:type="spellStart"/>
+      <w:r>
+        <w:rPr>
+          <w:rFonts w:ascii="Aptos Narrow" w:hAnsi="Aptos Narrow"/>
+        </w:rPr>
+        <w:t>непосещенные</w:t>
+      </w:r>
+      <w:proofErr w:type="spellEnd"/>
+      <w:r>
+        <w:rPr>
+          <w:rFonts w:ascii="Aptos Narrow" w:hAnsi="Aptos Narrow"/>
+        </w:rPr>
+        <w:t xml:space="preserve"> вершины в приоритетную очередь.</w:t>
       </w:r>
     </w:p>
     <w:p>
@@ -25879,7 +25971,21 @@
         <w:rPr>
           <w:rFonts w:ascii="Aptos Narrow" w:hAnsi="Aptos Narrow"/>
         </w:rPr>
-        <w:t xml:space="preserve">Повторять шаги 2-3, пока не прошли все вершины. </w:t>
+        <w:t xml:space="preserve">Повторять шаги </w:t>
+      </w:r>
+      <w:proofErr w:type="gramStart"/>
+      <w:r>
+        <w:rPr>
+          <w:rFonts w:ascii="Aptos Narrow" w:hAnsi="Aptos Narrow"/>
+        </w:rPr>
+        <w:t>2-3</w:t>
+      </w:r>
+      <w:proofErr w:type="gramEnd"/>
+      <w:r>
+        <w:rPr>
+          <w:rFonts w:ascii="Aptos Narrow" w:hAnsi="Aptos Narrow"/>
+        </w:rPr>
+        <w:t xml:space="preserve">, пока не прошли все вершины. </w:t>
       </w:r>
     </w:p>
     <w:p>
@@ -25887,7 +25993,6 @@
         <w:ind w:left="708"/>
         <w:rPr>
           <w:rFonts w:ascii="Aptos Narrow" w:hAnsi="Aptos Narrow"/>
-          <w:lang w:val="en-US"/>
         </w:rPr>
       </w:pPr>
     </w:p>
@@ -25923,12 +26028,16 @@
             <w:r>
               <w:rPr>
                 <w:rFonts w:ascii="Aptos Narrow" w:hAnsi="Aptos Narrow"/>
+                <w:b/>
+                <w:bCs/>
+                <w:sz w:val="28"/>
+                <w:szCs w:val="28"/>
               </w:rPr>
               <w:drawing>
-                <wp:inline distT="0" distB="0" distL="0" distR="0" wp14:anchorId="1434BB74" wp14:editId="141DE57E">
-                  <wp:extent cx="5326276" cy="3656370"/>
-                  <wp:effectExtent l="0" t="0" r="8255" b="1270"/>
-                  <wp:docPr id="1283871112" name="Рисунок 1"/>
+                <wp:inline distT="0" distB="0" distL="0" distR="0" wp14:anchorId="02E4BA20" wp14:editId="7544F713">
+                  <wp:extent cx="5155940" cy="3410472"/>
+                  <wp:effectExtent l="0" t="0" r="6985" b="0"/>
+                  <wp:docPr id="1347213852" name="Рисунок 1"/>
                   <wp:cNvGraphicFramePr>
                     <a:graphicFrameLocks xmlns:a="http://schemas.openxmlformats.org/drawingml/2006/main" noChangeAspect="1"/>
                   </wp:cNvGraphicFramePr>
@@ -25936,7 +26045,7 @@
                     <a:graphicData uri="http://schemas.openxmlformats.org/drawingml/2006/picture">
                       <pic:pic xmlns:pic="http://schemas.openxmlformats.org/drawingml/2006/picture">
                         <pic:nvPicPr>
-                          <pic:cNvPr id="1283871112" name=""/>
+                          <pic:cNvPr id="1698814085" name=""/>
                           <pic:cNvPicPr/>
                         </pic:nvPicPr>
                         <pic:blipFill>
@@ -25948,7 +26057,7 @@
                         <pic:spPr>
                           <a:xfrm>
                             <a:off x="0" y="0"/>
-                            <a:ext cx="5353779" cy="3675250"/>
+                            <a:ext cx="5172550" cy="3421459"/>
                           </a:xfrm>
                           <a:prstGeom prst="rect">
                             <a:avLst/>
@@ -25980,10 +26089,10 @@
               </w:rPr>
               <w:lastRenderedPageBreak/>
               <w:drawing>
-                <wp:inline distT="0" distB="0" distL="0" distR="0" wp14:anchorId="12C52558" wp14:editId="69FFD7EE">
-                  <wp:extent cx="5325644" cy="4135272"/>
-                  <wp:effectExtent l="0" t="0" r="8890" b="0"/>
-                  <wp:docPr id="1826249985" name="Рисунок 1"/>
+                <wp:inline distT="0" distB="0" distL="0" distR="0" wp14:anchorId="7ACD21EB" wp14:editId="56505618">
+                  <wp:extent cx="5091339" cy="3306241"/>
+                  <wp:effectExtent l="0" t="0" r="0" b="8890"/>
+                  <wp:docPr id="503414613" name="Рисунок 1"/>
                   <wp:cNvGraphicFramePr>
                     <a:graphicFrameLocks xmlns:a="http://schemas.openxmlformats.org/drawingml/2006/main" noChangeAspect="1"/>
                   </wp:cNvGraphicFramePr>
@@ -25991,7 +26100,7 @@
                     <a:graphicData uri="http://schemas.openxmlformats.org/drawingml/2006/picture">
                       <pic:pic xmlns:pic="http://schemas.openxmlformats.org/drawingml/2006/picture">
                         <pic:nvPicPr>
-                          <pic:cNvPr id="1826249985" name=""/>
+                          <pic:cNvPr id="503414613" name=""/>
                           <pic:cNvPicPr/>
                         </pic:nvPicPr>
                         <pic:blipFill>
@@ -26003,7 +26112,7 @@
                         <pic:spPr>
                           <a:xfrm>
                             <a:off x="0" y="0"/>
-                            <a:ext cx="5340260" cy="4146621"/>
+                            <a:ext cx="5101217" cy="3312656"/>
                           </a:xfrm>
                           <a:prstGeom prst="rect">
                             <a:avLst/>
@@ -26034,10 +26143,10 @@
                 <w:rFonts w:ascii="Aptos Narrow" w:hAnsi="Aptos Narrow"/>
               </w:rPr>
               <w:drawing>
-                <wp:inline distT="0" distB="0" distL="0" distR="0" wp14:anchorId="684BEE02" wp14:editId="5C028D7D">
-                  <wp:extent cx="5278509" cy="4083439"/>
-                  <wp:effectExtent l="0" t="0" r="0" b="0"/>
-                  <wp:docPr id="690086083" name="Рисунок 1"/>
+                <wp:inline distT="0" distB="0" distL="0" distR="0" wp14:anchorId="35EE2D9D" wp14:editId="5E965AF1">
+                  <wp:extent cx="5043838" cy="3333624"/>
+                  <wp:effectExtent l="0" t="0" r="4445" b="635"/>
+                  <wp:docPr id="378954759" name="Рисунок 1"/>
                   <wp:cNvGraphicFramePr>
                     <a:graphicFrameLocks xmlns:a="http://schemas.openxmlformats.org/drawingml/2006/main" noChangeAspect="1"/>
                   </wp:cNvGraphicFramePr>
@@ -26045,7 +26154,7 @@
                     <a:graphicData uri="http://schemas.openxmlformats.org/drawingml/2006/picture">
                       <pic:pic xmlns:pic="http://schemas.openxmlformats.org/drawingml/2006/picture">
                         <pic:nvPicPr>
-                          <pic:cNvPr id="690086083" name=""/>
+                          <pic:cNvPr id="378954759" name=""/>
                           <pic:cNvPicPr/>
                         </pic:nvPicPr>
                         <pic:blipFill>
@@ -26057,7 +26166,7 @@
                         <pic:spPr>
                           <a:xfrm>
                             <a:off x="0" y="0"/>
-                            <a:ext cx="5297472" cy="4098108"/>
+                            <a:ext cx="5054519" cy="3340683"/>
                           </a:xfrm>
                           <a:prstGeom prst="rect">
                             <a:avLst/>
@@ -26089,10 +26198,10 @@
               </w:rPr>
               <w:lastRenderedPageBreak/>
               <w:drawing>
-                <wp:inline distT="0" distB="0" distL="0" distR="0" wp14:anchorId="1D787EC4" wp14:editId="32BF509B">
-                  <wp:extent cx="5346747" cy="4147658"/>
-                  <wp:effectExtent l="0" t="0" r="6350" b="5715"/>
-                  <wp:docPr id="2041607728" name="Рисунок 1"/>
+                <wp:inline distT="0" distB="0" distL="0" distR="0" wp14:anchorId="2A95AD5A" wp14:editId="5A5B12AD">
+                  <wp:extent cx="5293220" cy="3583886"/>
+                  <wp:effectExtent l="0" t="0" r="3175" b="0"/>
+                  <wp:docPr id="927647948" name="Рисунок 1"/>
                   <wp:cNvGraphicFramePr>
                     <a:graphicFrameLocks xmlns:a="http://schemas.openxmlformats.org/drawingml/2006/main" noChangeAspect="1"/>
                   </wp:cNvGraphicFramePr>
@@ -26100,7 +26209,7 @@
                     <a:graphicData uri="http://schemas.openxmlformats.org/drawingml/2006/picture">
                       <pic:pic xmlns:pic="http://schemas.openxmlformats.org/drawingml/2006/picture">
                         <pic:nvPicPr>
-                          <pic:cNvPr id="2041607728" name=""/>
+                          <pic:cNvPr id="927647948" name=""/>
                           <pic:cNvPicPr/>
                         </pic:nvPicPr>
                         <pic:blipFill>
@@ -26112,7 +26221,7 @@
                         <pic:spPr>
                           <a:xfrm>
                             <a:off x="0" y="0"/>
-                            <a:ext cx="5359396" cy="4157470"/>
+                            <a:ext cx="5300779" cy="3589004"/>
                           </a:xfrm>
                           <a:prstGeom prst="rect">
                             <a:avLst/>
@@ -26143,10 +26252,10 @@
                 <w:rFonts w:ascii="Aptos Narrow" w:hAnsi="Aptos Narrow"/>
               </w:rPr>
               <w:drawing>
-                <wp:inline distT="0" distB="0" distL="0" distR="0" wp14:anchorId="0D6DCF2E" wp14:editId="56629F0D">
-                  <wp:extent cx="5333100" cy="4176977"/>
-                  <wp:effectExtent l="0" t="0" r="1270" b="0"/>
-                  <wp:docPr id="1394542227" name="Рисунок 1"/>
+                <wp:inline distT="0" distB="0" distL="0" distR="0" wp14:anchorId="278C4AFA" wp14:editId="62DA3939">
+                  <wp:extent cx="5180404" cy="3406718"/>
+                  <wp:effectExtent l="0" t="0" r="1270" b="3810"/>
+                  <wp:docPr id="2034089670" name="Рисунок 1"/>
                   <wp:cNvGraphicFramePr>
                     <a:graphicFrameLocks xmlns:a="http://schemas.openxmlformats.org/drawingml/2006/main" noChangeAspect="1"/>
                   </wp:cNvGraphicFramePr>
@@ -26154,7 +26263,7 @@
                     <a:graphicData uri="http://schemas.openxmlformats.org/drawingml/2006/picture">
                       <pic:pic xmlns:pic="http://schemas.openxmlformats.org/drawingml/2006/picture">
                         <pic:nvPicPr>
-                          <pic:cNvPr id="1394542227" name=""/>
+                          <pic:cNvPr id="2034089670" name=""/>
                           <pic:cNvPicPr/>
                         </pic:nvPicPr>
                         <pic:blipFill>
@@ -26166,7 +26275,7 @@
                         <pic:spPr>
                           <a:xfrm>
                             <a:off x="0" y="0"/>
-                            <a:ext cx="5343764" cy="4185329"/>
+                            <a:ext cx="5188617" cy="3412119"/>
                           </a:xfrm>
                           <a:prstGeom prst="rect">
                             <a:avLst/>
@@ -26198,10 +26307,10 @@
               </w:rPr>
               <w:lastRenderedPageBreak/>
               <w:drawing>
-                <wp:inline distT="0" distB="0" distL="0" distR="0" wp14:anchorId="79E4AF6E" wp14:editId="552AF90F">
-                  <wp:extent cx="5292156" cy="4094562"/>
-                  <wp:effectExtent l="0" t="0" r="3810" b="1270"/>
-                  <wp:docPr id="1385623297" name="Рисунок 1"/>
+                <wp:inline distT="0" distB="0" distL="0" distR="0" wp14:anchorId="0966147F" wp14:editId="45B41958">
+                  <wp:extent cx="5227149" cy="3524065"/>
+                  <wp:effectExtent l="0" t="0" r="0" b="635"/>
+                  <wp:docPr id="780807458" name="Рисунок 1"/>
                   <wp:cNvGraphicFramePr>
                     <a:graphicFrameLocks xmlns:a="http://schemas.openxmlformats.org/drawingml/2006/main" noChangeAspect="1"/>
                   </wp:cNvGraphicFramePr>
@@ -26209,7 +26318,7 @@
                     <a:graphicData uri="http://schemas.openxmlformats.org/drawingml/2006/picture">
                       <pic:pic xmlns:pic="http://schemas.openxmlformats.org/drawingml/2006/picture">
                         <pic:nvPicPr>
-                          <pic:cNvPr id="1966240018" name=""/>
+                          <pic:cNvPr id="780807458" name=""/>
                           <pic:cNvPicPr/>
                         </pic:nvPicPr>
                         <pic:blipFill>
@@ -26221,7 +26330,7 @@
                         <pic:spPr>
                           <a:xfrm>
                             <a:off x="0" y="0"/>
-                            <a:ext cx="5299824" cy="4100495"/>
+                            <a:ext cx="5245894" cy="3536703"/>
                           </a:xfrm>
                           <a:prstGeom prst="rect">
                             <a:avLst/>
@@ -26252,10 +26361,10 @@
                 <w:rFonts w:ascii="Aptos Narrow" w:hAnsi="Aptos Narrow"/>
               </w:rPr>
               <w:drawing>
-                <wp:inline distT="0" distB="0" distL="0" distR="0" wp14:anchorId="7FD61498" wp14:editId="35B1BCE6">
-                  <wp:extent cx="5285333" cy="4163294"/>
-                  <wp:effectExtent l="0" t="0" r="0" b="8890"/>
-                  <wp:docPr id="123670218" name="Рисунок 1"/>
+                <wp:inline distT="0" distB="0" distL="0" distR="0" wp14:anchorId="29074AE2" wp14:editId="60C75152">
+                  <wp:extent cx="5144778" cy="3423436"/>
+                  <wp:effectExtent l="0" t="0" r="0" b="5715"/>
+                  <wp:docPr id="496558205" name="Рисунок 1"/>
                   <wp:cNvGraphicFramePr>
                     <a:graphicFrameLocks xmlns:a="http://schemas.openxmlformats.org/drawingml/2006/main" noChangeAspect="1"/>
                   </wp:cNvGraphicFramePr>
@@ -26263,7 +26372,7 @@
                     <a:graphicData uri="http://schemas.openxmlformats.org/drawingml/2006/picture">
                       <pic:pic xmlns:pic="http://schemas.openxmlformats.org/drawingml/2006/picture">
                         <pic:nvPicPr>
-                          <pic:cNvPr id="123670218" name=""/>
+                          <pic:cNvPr id="496558205" name=""/>
                           <pic:cNvPicPr/>
                         </pic:nvPicPr>
                         <pic:blipFill>
@@ -26275,7 +26384,7 @@
                         <pic:spPr>
                           <a:xfrm>
                             <a:off x="0" y="0"/>
-                            <a:ext cx="5290799" cy="4167599"/>
+                            <a:ext cx="5151442" cy="3427870"/>
                           </a:xfrm>
                           <a:prstGeom prst="rect">
                             <a:avLst/>
@@ -26345,7 +26454,21 @@
         <w:rPr>
           <w:rFonts w:ascii="Aptos Narrow" w:hAnsi="Aptos Narrow"/>
         </w:rPr>
-        <w:t xml:space="preserve">Алгоритм Краскала </w:t>
+        <w:t xml:space="preserve">Алгоритм </w:t>
+      </w:r>
+      <w:proofErr w:type="spellStart"/>
+      <w:r>
+        <w:rPr>
+          <w:rFonts w:ascii="Aptos Narrow" w:hAnsi="Aptos Narrow"/>
+        </w:rPr>
+        <w:t>Краскала</w:t>
+      </w:r>
+      <w:proofErr w:type="spellEnd"/>
+      <w:r>
+        <w:rPr>
+          <w:rFonts w:ascii="Aptos Narrow" w:hAnsi="Aptos Narrow"/>
+        </w:rPr>
+        <w:t xml:space="preserve"> </w:t>
       </w:r>
     </w:p>
     <w:p>
@@ -26379,7 +26502,6 @@
         <w:rPr>
           <w:rFonts w:ascii="Aptos Narrow" w:hAnsi="Aptos Narrow"/>
         </w:rPr>
-        <w:lastRenderedPageBreak/>
         <w:t>Отсортировать все ребра графа по возрастанию их веса (от самого легкого к самому тяжелому).</w:t>
       </w:r>
     </w:p>
@@ -26431,7 +26553,21 @@
         <w:rPr>
           <w:rFonts w:ascii="Aptos Narrow" w:hAnsi="Aptos Narrow"/>
         </w:rPr>
-        <w:t>Если к разным: добавить ребро в остовное дерево и объединить эти два множества в одно.</w:t>
+        <w:t xml:space="preserve">Если к разным: добавить ребро в </w:t>
+      </w:r>
+      <w:proofErr w:type="spellStart"/>
+      <w:r>
+        <w:rPr>
+          <w:rFonts w:ascii="Aptos Narrow" w:hAnsi="Aptos Narrow"/>
+        </w:rPr>
+        <w:t>остовное</w:t>
+      </w:r>
+      <w:proofErr w:type="spellEnd"/>
+      <w:r>
+        <w:rPr>
+          <w:rFonts w:ascii="Aptos Narrow" w:hAnsi="Aptos Narrow"/>
+        </w:rPr>
+        <w:t xml:space="preserve"> дерево и объединить эти два множества в одно.</w:t>
       </w:r>
     </w:p>
     <w:p>
@@ -26448,6 +26584,7 @@
         <w:rPr>
           <w:rFonts w:ascii="Aptos Narrow" w:hAnsi="Aptos Narrow"/>
         </w:rPr>
+        <w:lastRenderedPageBreak/>
         <w:t>Если к одному: пропустить это ребро (так как его добавление создаст цикл).</w:t>
       </w:r>
     </w:p>
@@ -26484,6 +26621,7 @@
           </w:tcPr>
           <w:p>
             <w:pPr>
+              <w:jc w:val="center"/>
               <w:rPr>
                 <w:rFonts w:ascii="Aptos Narrow" w:hAnsi="Aptos Narrow"/>
                 <w:b/>
@@ -26501,10 +26639,10 @@
                 <w:szCs w:val="28"/>
               </w:rPr>
               <w:drawing>
-                <wp:inline distT="0" distB="0" distL="0" distR="0" wp14:anchorId="4D117BC5" wp14:editId="6D036428">
-                  <wp:extent cx="5768975" cy="3848656"/>
-                  <wp:effectExtent l="0" t="0" r="3175" b="0"/>
-                  <wp:docPr id="1416294940" name="Рисунок 1"/>
+                <wp:inline distT="0" distB="0" distL="0" distR="0" wp14:anchorId="1A6425CF" wp14:editId="20C59E00">
+                  <wp:extent cx="5803858" cy="3839046"/>
+                  <wp:effectExtent l="0" t="0" r="6985" b="9525"/>
+                  <wp:docPr id="1698814085" name="Рисунок 1"/>
                   <wp:cNvGraphicFramePr>
                     <a:graphicFrameLocks xmlns:a="http://schemas.openxmlformats.org/drawingml/2006/main" noChangeAspect="1"/>
                   </wp:cNvGraphicFramePr>
@@ -26512,7 +26650,70 @@
                     <a:graphicData uri="http://schemas.openxmlformats.org/drawingml/2006/picture">
                       <pic:pic xmlns:pic="http://schemas.openxmlformats.org/drawingml/2006/picture">
                         <pic:nvPicPr>
-                          <pic:cNvPr id="1416294940" name=""/>
+                          <pic:cNvPr id="1698814085" name=""/>
+                          <pic:cNvPicPr/>
+                        </pic:nvPicPr>
+                        <pic:blipFill>
+                          <a:blip r:embed="rId37"/>
+                          <a:stretch>
+                            <a:fillRect/>
+                          </a:stretch>
+                        </pic:blipFill>
+                        <pic:spPr>
+                          <a:xfrm>
+                            <a:off x="0" y="0"/>
+                            <a:ext cx="5810470" cy="3843420"/>
+                          </a:xfrm>
+                          <a:prstGeom prst="rect">
+                            <a:avLst/>
+                          </a:prstGeom>
+                        </pic:spPr>
+                      </pic:pic>
+                    </a:graphicData>
+                  </a:graphic>
+                </wp:inline>
+              </w:drawing>
+            </w:r>
+          </w:p>
+        </w:tc>
+      </w:tr>
+      <w:tr>
+        <w:tc>
+          <w:tcPr>
+            <w:tcW w:w="9345" w:type="dxa"/>
+          </w:tcPr>
+          <w:p>
+            <w:pPr>
+              <w:jc w:val="center"/>
+              <w:rPr>
+                <w:rFonts w:ascii="Aptos Narrow" w:hAnsi="Aptos Narrow"/>
+                <w:b/>
+                <w:bCs/>
+                <w:sz w:val="28"/>
+                <w:szCs w:val="28"/>
+              </w:rPr>
+            </w:pPr>
+            <w:r>
+              <w:rPr>
+                <w:rFonts w:ascii="Aptos Narrow" w:hAnsi="Aptos Narrow"/>
+                <w:b/>
+                <w:bCs/>
+                <w:sz w:val="28"/>
+                <w:szCs w:val="28"/>
+              </w:rPr>
+              <w:drawing>
+                <wp:inline distT="0" distB="0" distL="0" distR="0" wp14:anchorId="726CFDAD" wp14:editId="0420F503">
+                  <wp:extent cx="5803858" cy="3822915"/>
+                  <wp:effectExtent l="0" t="0" r="6985" b="6350"/>
+                  <wp:docPr id="874298178" name="Рисунок 1"/>
+                  <wp:cNvGraphicFramePr>
+                    <a:graphicFrameLocks xmlns:a="http://schemas.openxmlformats.org/drawingml/2006/main" noChangeAspect="1"/>
+                  </wp:cNvGraphicFramePr>
+                  <a:graphic xmlns:a="http://schemas.openxmlformats.org/drawingml/2006/main">
+                    <a:graphicData uri="http://schemas.openxmlformats.org/drawingml/2006/picture">
+                      <pic:pic xmlns:pic="http://schemas.openxmlformats.org/drawingml/2006/picture">
+                        <pic:nvPicPr>
+                          <pic:cNvPr id="874298178" name=""/>
                           <pic:cNvPicPr/>
                         </pic:nvPicPr>
                         <pic:blipFill>
@@ -26524,7 +26725,7 @@
                         <pic:spPr>
                           <a:xfrm>
                             <a:off x="0" y="0"/>
-                            <a:ext cx="5779762" cy="3855852"/>
+                            <a:ext cx="5808916" cy="3826246"/>
                           </a:xfrm>
                           <a:prstGeom prst="rect">
                             <a:avLst/>
@@ -26546,6 +26747,7 @@
           </w:tcPr>
           <w:p>
             <w:pPr>
+              <w:jc w:val="center"/>
               <w:rPr>
                 <w:rFonts w:ascii="Aptos Narrow" w:hAnsi="Aptos Narrow"/>
                 <w:b/>
@@ -26564,10 +26766,10 @@
               </w:rPr>
               <w:lastRenderedPageBreak/>
               <w:drawing>
-                <wp:inline distT="0" distB="0" distL="0" distR="0" wp14:anchorId="51D1AA08" wp14:editId="5FD79CBA">
-                  <wp:extent cx="5756275" cy="3762653"/>
-                  <wp:effectExtent l="0" t="0" r="0" b="9525"/>
-                  <wp:docPr id="1229218819" name="Рисунок 1"/>
+                <wp:inline distT="0" distB="0" distL="0" distR="0" wp14:anchorId="28B8BEF0" wp14:editId="2912E818">
+                  <wp:extent cx="5613853" cy="3721165"/>
+                  <wp:effectExtent l="0" t="0" r="6350" b="0"/>
+                  <wp:docPr id="927428128" name="Рисунок 1"/>
                   <wp:cNvGraphicFramePr>
                     <a:graphicFrameLocks xmlns:a="http://schemas.openxmlformats.org/drawingml/2006/main" noChangeAspect="1"/>
                   </wp:cNvGraphicFramePr>
@@ -26575,7 +26777,7 @@
                     <a:graphicData uri="http://schemas.openxmlformats.org/drawingml/2006/picture">
                       <pic:pic xmlns:pic="http://schemas.openxmlformats.org/drawingml/2006/picture">
                         <pic:nvPicPr>
-                          <pic:cNvPr id="1229218819" name=""/>
+                          <pic:cNvPr id="927428128" name=""/>
                           <pic:cNvPicPr/>
                         </pic:nvPicPr>
                         <pic:blipFill>
@@ -26587,7 +26789,7 @@
                         <pic:spPr>
                           <a:xfrm>
                             <a:off x="0" y="0"/>
-                            <a:ext cx="5767614" cy="3770065"/>
+                            <a:ext cx="5617352" cy="3723485"/>
                           </a:xfrm>
                           <a:prstGeom prst="rect">
                             <a:avLst/>
@@ -26609,6 +26811,7 @@
           </w:tcPr>
           <w:p>
             <w:pPr>
+              <w:jc w:val="center"/>
               <w:rPr>
                 <w:rFonts w:ascii="Aptos Narrow" w:hAnsi="Aptos Narrow"/>
                 <w:b/>
@@ -26626,10 +26829,10 @@
                 <w:szCs w:val="28"/>
               </w:rPr>
               <w:drawing>
-                <wp:inline distT="0" distB="0" distL="0" distR="0" wp14:anchorId="10D100B3" wp14:editId="54AB6D08">
-                  <wp:extent cx="5756275" cy="3834645"/>
-                  <wp:effectExtent l="0" t="0" r="0" b="0"/>
-                  <wp:docPr id="2040043200" name="Рисунок 1"/>
+                <wp:inline distT="0" distB="0" distL="0" distR="0" wp14:anchorId="268D009F" wp14:editId="7E35C578">
+                  <wp:extent cx="5536663" cy="3637449"/>
+                  <wp:effectExtent l="0" t="0" r="6985" b="1270"/>
+                  <wp:docPr id="115852832" name="Рисунок 1"/>
                   <wp:cNvGraphicFramePr>
                     <a:graphicFrameLocks xmlns:a="http://schemas.openxmlformats.org/drawingml/2006/main" noChangeAspect="1"/>
                   </wp:cNvGraphicFramePr>
@@ -26637,7 +26840,7 @@
                     <a:graphicData uri="http://schemas.openxmlformats.org/drawingml/2006/picture">
                       <pic:pic xmlns:pic="http://schemas.openxmlformats.org/drawingml/2006/picture">
                         <pic:nvPicPr>
-                          <pic:cNvPr id="2040043200" name=""/>
+                          <pic:cNvPr id="115852832" name=""/>
                           <pic:cNvPicPr/>
                         </pic:nvPicPr>
                         <pic:blipFill>
@@ -26649,7 +26852,7 @@
                         <pic:spPr>
                           <a:xfrm>
                             <a:off x="0" y="0"/>
-                            <a:ext cx="5762030" cy="3838479"/>
+                            <a:ext cx="5540551" cy="3640003"/>
                           </a:xfrm>
                           <a:prstGeom prst="rect">
                             <a:avLst/>
@@ -26671,6 +26874,7 @@
           </w:tcPr>
           <w:p>
             <w:pPr>
+              <w:jc w:val="center"/>
               <w:rPr>
                 <w:rFonts w:ascii="Aptos Narrow" w:hAnsi="Aptos Narrow"/>
                 <w:b/>
@@ -26689,10 +26893,10 @@
               </w:rPr>
               <w:lastRenderedPageBreak/>
               <w:drawing>
-                <wp:inline distT="0" distB="0" distL="0" distR="0" wp14:anchorId="5DBADC94" wp14:editId="20EABEB1">
-                  <wp:extent cx="5800725" cy="3850615"/>
+                <wp:inline distT="0" distB="0" distL="0" distR="0" wp14:anchorId="1A54208E" wp14:editId="50B3350C">
+                  <wp:extent cx="5702918" cy="3837506"/>
                   <wp:effectExtent l="0" t="0" r="0" b="0"/>
-                  <wp:docPr id="528089131" name="Рисунок 1"/>
+                  <wp:docPr id="532833940" name="Рисунок 1"/>
                   <wp:cNvGraphicFramePr>
                     <a:graphicFrameLocks xmlns:a="http://schemas.openxmlformats.org/drawingml/2006/main" noChangeAspect="1"/>
                   </wp:cNvGraphicFramePr>
@@ -26700,7 +26904,7 @@
                     <a:graphicData uri="http://schemas.openxmlformats.org/drawingml/2006/picture">
                       <pic:pic xmlns:pic="http://schemas.openxmlformats.org/drawingml/2006/picture">
                         <pic:nvPicPr>
-                          <pic:cNvPr id="528089131" name=""/>
+                          <pic:cNvPr id="532833940" name=""/>
                           <pic:cNvPicPr/>
                         </pic:nvPicPr>
                         <pic:blipFill>
@@ -26712,7 +26916,7 @@
                         <pic:spPr>
                           <a:xfrm>
                             <a:off x="0" y="0"/>
-                            <a:ext cx="5810478" cy="3857089"/>
+                            <a:ext cx="5706001" cy="3839581"/>
                           </a:xfrm>
                           <a:prstGeom prst="rect">
                             <a:avLst/>
@@ -26734,6 +26938,7 @@
           </w:tcPr>
           <w:p>
             <w:pPr>
+              <w:jc w:val="center"/>
               <w:rPr>
                 <w:rFonts w:ascii="Aptos Narrow" w:hAnsi="Aptos Narrow"/>
                 <w:b/>
@@ -26751,10 +26956,10 @@
                 <w:szCs w:val="28"/>
               </w:rPr>
               <w:drawing>
-                <wp:inline distT="0" distB="0" distL="0" distR="0" wp14:anchorId="061CEC3E" wp14:editId="0931889C">
-                  <wp:extent cx="5775325" cy="3849805"/>
-                  <wp:effectExtent l="0" t="0" r="0" b="0"/>
-                  <wp:docPr id="764902500" name="Рисунок 1"/>
+                <wp:inline distT="0" distB="0" distL="0" distR="0" wp14:anchorId="129CE83A" wp14:editId="24CB840A">
+                  <wp:extent cx="5607915" cy="3711235"/>
+                  <wp:effectExtent l="0" t="0" r="0" b="3810"/>
+                  <wp:docPr id="1275093003" name="Рисунок 1"/>
                   <wp:cNvGraphicFramePr>
                     <a:graphicFrameLocks xmlns:a="http://schemas.openxmlformats.org/drawingml/2006/main" noChangeAspect="1"/>
                   </wp:cNvGraphicFramePr>
@@ -26762,7 +26967,7 @@
                     <a:graphicData uri="http://schemas.openxmlformats.org/drawingml/2006/picture">
                       <pic:pic xmlns:pic="http://schemas.openxmlformats.org/drawingml/2006/picture">
                         <pic:nvPicPr>
-                          <pic:cNvPr id="764902500" name=""/>
+                          <pic:cNvPr id="1275093003" name=""/>
                           <pic:cNvPicPr/>
                         </pic:nvPicPr>
                         <pic:blipFill>
@@ -26774,7 +26979,7 @@
                         <pic:spPr>
                           <a:xfrm>
                             <a:off x="0" y="0"/>
-                            <a:ext cx="5779491" cy="3852582"/>
+                            <a:ext cx="5611574" cy="3713656"/>
                           </a:xfrm>
                           <a:prstGeom prst="rect">
                             <a:avLst/>
@@ -26796,6 +27001,7 @@
           </w:tcPr>
           <w:p>
             <w:pPr>
+              <w:jc w:val="center"/>
               <w:rPr>
                 <w:rFonts w:ascii="Aptos Narrow" w:hAnsi="Aptos Narrow"/>
                 <w:b/>
@@ -26814,10 +27020,10 @@
               </w:rPr>
               <w:lastRenderedPageBreak/>
               <w:drawing>
-                <wp:inline distT="0" distB="0" distL="0" distR="0" wp14:anchorId="36A393B1" wp14:editId="3396ED17">
-                  <wp:extent cx="5730875" cy="3735636"/>
-                  <wp:effectExtent l="0" t="0" r="3175" b="0"/>
-                  <wp:docPr id="999447031" name="Рисунок 1"/>
+                <wp:inline distT="0" distB="0" distL="0" distR="0" wp14:anchorId="08D2F09E" wp14:editId="369C93C5">
+                  <wp:extent cx="5578227" cy="3771490"/>
+                  <wp:effectExtent l="0" t="0" r="3810" b="635"/>
+                  <wp:docPr id="924813917" name="Рисунок 1"/>
                   <wp:cNvGraphicFramePr>
                     <a:graphicFrameLocks xmlns:a="http://schemas.openxmlformats.org/drawingml/2006/main" noChangeAspect="1"/>
                   </wp:cNvGraphicFramePr>
@@ -26825,7 +27031,7 @@
                     <a:graphicData uri="http://schemas.openxmlformats.org/drawingml/2006/picture">
                       <pic:pic xmlns:pic="http://schemas.openxmlformats.org/drawingml/2006/picture">
                         <pic:nvPicPr>
-                          <pic:cNvPr id="999447031" name=""/>
+                          <pic:cNvPr id="924813917" name=""/>
                           <pic:cNvPicPr/>
                         </pic:nvPicPr>
                         <pic:blipFill>
@@ -26837,69 +27043,7 @@
                         <pic:spPr>
                           <a:xfrm>
                             <a:off x="0" y="0"/>
-                            <a:ext cx="5738019" cy="3740293"/>
-                          </a:xfrm>
-                          <a:prstGeom prst="rect">
-                            <a:avLst/>
-                          </a:prstGeom>
-                        </pic:spPr>
-                      </pic:pic>
-                    </a:graphicData>
-                  </a:graphic>
-                </wp:inline>
-              </w:drawing>
-            </w:r>
-          </w:p>
-        </w:tc>
-      </w:tr>
-      <w:tr>
-        <w:tc>
-          <w:tcPr>
-            <w:tcW w:w="9345" w:type="dxa"/>
-          </w:tcPr>
-          <w:p>
-            <w:pPr>
-              <w:rPr>
-                <w:rFonts w:ascii="Aptos Narrow" w:hAnsi="Aptos Narrow"/>
-                <w:b/>
-                <w:bCs/>
-                <w:sz w:val="28"/>
-                <w:szCs w:val="28"/>
-              </w:rPr>
-            </w:pPr>
-            <w:r>
-              <w:rPr>
-                <w:rFonts w:ascii="Aptos Narrow" w:hAnsi="Aptos Narrow"/>
-                <w:b/>
-                <w:bCs/>
-                <w:sz w:val="28"/>
-                <w:szCs w:val="28"/>
-              </w:rPr>
-              <w:drawing>
-                <wp:inline distT="0" distB="0" distL="0" distR="0" wp14:anchorId="7318346C" wp14:editId="45A920AA">
-                  <wp:extent cx="5775325" cy="3847336"/>
-                  <wp:effectExtent l="0" t="0" r="0" b="1270"/>
-                  <wp:docPr id="1512651171" name="Рисунок 1"/>
-                  <wp:cNvGraphicFramePr>
-                    <a:graphicFrameLocks xmlns:a="http://schemas.openxmlformats.org/drawingml/2006/main" noChangeAspect="1"/>
-                  </wp:cNvGraphicFramePr>
-                  <a:graphic xmlns:a="http://schemas.openxmlformats.org/drawingml/2006/main">
-                    <a:graphicData uri="http://schemas.openxmlformats.org/drawingml/2006/picture">
-                      <pic:pic xmlns:pic="http://schemas.openxmlformats.org/drawingml/2006/picture">
-                        <pic:nvPicPr>
-                          <pic:cNvPr id="1512651171" name=""/>
-                          <pic:cNvPicPr/>
-                        </pic:nvPicPr>
-                        <pic:blipFill>
-                          <a:blip r:embed="rId50"/>
-                          <a:stretch>
-                            <a:fillRect/>
-                          </a:stretch>
-                        </pic:blipFill>
-                        <pic:spPr>
-                          <a:xfrm>
-                            <a:off x="0" y="0"/>
-                            <a:ext cx="5779440" cy="3850077"/>
+                            <a:ext cx="5581607" cy="3773775"/>
                           </a:xfrm>
                           <a:prstGeom prst="rect">
                             <a:avLst/>
@@ -28356,6 +28500,7 @@
   <w:style w:type="character" w:default="1" w:styleId="a0">
     <w:name w:val="Default Paragraph Font"/>
     <w:uiPriority w:val="1"/>
+    <w:semiHidden/>
     <w:unhideWhenUsed/>
   </w:style>
   <w:style w:type="table" w:default="1" w:styleId="a1">

</xml_diff>